<commit_message>
Faltaba indicar lo del UML
</commit_message>
<xml_diff>
--- a/reports/C3/04 - Requirements - Student #4.docx
+++ b/reports/C3/04 - Requirements - Student #4.docx
@@ -428,23 +428,13 @@
                 <w:lang w:val="es-ES"/>
               </w:rPr>
             </w:pPr>
-            <w:proofErr w:type="spellStart"/>
             <w:r>
               <w:rPr>
                 <w:rFonts w:asciiTheme="majorHAnsi" w:hAnsiTheme="majorHAnsi" w:cstheme="majorHAnsi"/>
                 <w:b/>
                 <w:lang w:val="es-ES"/>
               </w:rPr>
-              <w:t>Name</w:t>
-            </w:r>
-            <w:proofErr w:type="spellEnd"/>
-            <w:r>
-              <w:rPr>
-                <w:rFonts w:asciiTheme="majorHAnsi" w:hAnsiTheme="majorHAnsi" w:cstheme="majorHAnsi"/>
-                <w:b/>
-                <w:lang w:val="es-ES"/>
-              </w:rPr>
-              <w:t>:</w:t>
+              <w:t>Name:</w:t>
             </w:r>
             <w:r>
               <w:rPr>
@@ -561,17 +551,8 @@
                     <w:rFonts w:asciiTheme="majorHAnsi" w:hAnsiTheme="majorHAnsi" w:cstheme="majorHAnsi"/>
                     <w:lang w:val="es-ES"/>
                   </w:rPr>
-                  <w:t xml:space="preserve">Analista, Desarrollador y </w:t>
+                  <w:t>Analista, Desarrollador y Tester</w:t>
                 </w:r>
-                <w:proofErr w:type="spellStart"/>
-                <w:r>
-                  <w:rPr>
-                    <w:rFonts w:asciiTheme="majorHAnsi" w:hAnsiTheme="majorHAnsi" w:cstheme="majorHAnsi"/>
-                    <w:lang w:val="es-ES"/>
-                  </w:rPr>
-                  <w:t>Tester</w:t>
-                </w:r>
-                <w:proofErr w:type="spellEnd"/>
               </w:sdtContent>
             </w:sdt>
             <w:permEnd w:id="16126159"/>
@@ -649,7 +630,6 @@
                   </w:rPr>
                   <w:t xml:space="preserve">Sevilla </w:t>
                 </w:r>
-                <w:proofErr w:type="spellStart"/>
                 <w:r>
                   <w:rPr>
                     <w:rFonts w:asciiTheme="majorHAnsi" w:hAnsiTheme="majorHAnsi" w:cstheme="majorHAnsi"/>
@@ -660,14 +640,7 @@
                   <w:rPr>
                     <w:rFonts w:asciiTheme="majorHAnsi" w:hAnsiTheme="majorHAnsi" w:cstheme="majorHAnsi"/>
                   </w:rPr>
-                  <w:t>ebrero</w:t>
-                </w:r>
-                <w:proofErr w:type="spellEnd"/>
-                <w:r>
-                  <w:rPr>
-                    <w:rFonts w:asciiTheme="majorHAnsi" w:hAnsiTheme="majorHAnsi" w:cstheme="majorHAnsi"/>
-                  </w:rPr>
-                  <w:t xml:space="preserve"> 18, 2025</w:t>
+                  <w:t>ebrero 18, 2025</w:t>
                 </w:r>
                 <w:r>
                   <w:rPr>
@@ -1781,20 +1754,107 @@
         <w:rPr>
           <w:lang w:val="es-ES"/>
         </w:rPr>
-        <w:t xml:space="preserve">No se ha incluido </w:t>
-      </w:r>
-      <w:proofErr w:type="spellStart"/>
-      <w:r>
+        <w:t>No se ha incluido indicator.</w:t>
+      </w:r>
+    </w:p>
+    <w:p>
+      <w:pPr>
+        <w:pStyle w:val="Comment-Grader"/>
         <w:rPr>
           <w:lang w:val="es-ES"/>
         </w:rPr>
-        <w:t>indicator</w:t>
-      </w:r>
-      <w:proofErr w:type="spellEnd"/>
+      </w:pPr>
       <w:r>
         <w:rPr>
           <w:lang w:val="es-ES"/>
         </w:rPr>
+        <w:t xml:space="preserve">Manuel J. Benito Merchán - </w:t>
+      </w:r>
+      <w:r>
+        <w:rPr>
+          <w:lang w:val="es-ES"/>
+        </w:rPr>
+        <w:t>Para solucionar este problema se han seguido una serie de pasos:</w:t>
+      </w:r>
+    </w:p>
+    <w:p>
+      <w:pPr>
+        <w:pStyle w:val="Comment-Grader"/>
+        <w:rPr>
+          <w:lang w:val="es-ES"/>
+        </w:rPr>
+      </w:pPr>
+      <w:r>
+        <w:rPr>
+          <w:lang w:val="es-ES"/>
+        </w:rPr>
+        <w:t>1.- Añadir el atributo indicator en la entidad.</w:t>
+      </w:r>
+    </w:p>
+    <w:p>
+      <w:pPr>
+        <w:pStyle w:val="Comment-Grader"/>
+        <w:rPr>
+          <w:lang w:val="es-ES"/>
+        </w:rPr>
+      </w:pPr>
+      <w:r>
+        <w:rPr>
+          <w:lang w:val="es-ES"/>
+        </w:rPr>
+        <w:t>2.- Añadir el nuevo atributo en los métodos bind y unbind donde correspondiera en las distintas features de los Tracking logs.</w:t>
+      </w:r>
+    </w:p>
+    <w:p>
+      <w:pPr>
+        <w:pStyle w:val="Comment-Grader"/>
+        <w:rPr>
+          <w:lang w:val="es-ES"/>
+        </w:rPr>
+      </w:pPr>
+      <w:r>
+        <w:rPr>
+          <w:lang w:val="es-ES"/>
+        </w:rPr>
+        <w:t>3.-</w:t>
+      </w:r>
+      <w:r>
+        <w:rPr>
+          <w:lang w:val="es-ES"/>
+        </w:rPr>
+        <w:t xml:space="preserve"> </w:t>
+      </w:r>
+      <w:r>
+        <w:rPr>
+          <w:lang w:val="es-ES"/>
+        </w:rPr>
+        <w:t>Al ser un atributo tipo enumerado en los métodos unbind debemos crear atributos tipo SelectChoices para este y añadirlos al datset.</w:t>
+      </w:r>
+    </w:p>
+    <w:p>
+      <w:pPr>
+        <w:pStyle w:val="Comment-Grader"/>
+        <w:rPr>
+          <w:lang w:val="es-ES"/>
+        </w:rPr>
+      </w:pPr>
+      <w:r>
+        <w:rPr>
+          <w:lang w:val="es-ES"/>
+        </w:rPr>
+        <w:lastRenderedPageBreak/>
+        <w:t>4.- Añadir nuevas etiquetas para el elemento indicator en los form.jsp y list.jsp (se ha decidido que cuando se use el comando “create” este elemento sea de tipo readonly con un valor por defecto)</w:t>
+      </w:r>
+      <w:r>
+        <w:rPr>
+          <w:lang w:val="es-ES"/>
+        </w:rPr>
+        <w:t xml:space="preserve"> (se ha controlado el posible hack en el método bind del create)</w:t>
+      </w:r>
+      <w:r>
+        <w:rPr>
+          <w:lang w:val="es-ES"/>
+        </w:rPr>
         <w:t>.</w:t>
       </w:r>
     </w:p>
@@ -1809,13 +1869,27 @@
         <w:rPr>
           <w:lang w:val="es-ES"/>
         </w:rPr>
-        <w:t xml:space="preserve">Manuel J. Benito Merchán - </w:t>
-      </w:r>
+        <w:t xml:space="preserve">5.- Añadir el atributo en el csv correspondiente y darle </w:t>
+      </w:r>
+      <w:proofErr w:type="gramStart"/>
       <w:r>
         <w:rPr>
           <w:lang w:val="es-ES"/>
         </w:rPr>
-        <w:t>Para solucionar este problema se han seguido una serie de pasos:</w:t>
+        <w:t>valores acorde</w:t>
+      </w:r>
+      <w:proofErr w:type="gramEnd"/>
+      <w:r>
+        <w:rPr>
+          <w:lang w:val="es-ES"/>
+        </w:rPr>
+        <w:t xml:space="preserve"> al contexto del log</w:t>
+      </w:r>
+      <w:r>
+        <w:rPr>
+          <w:lang w:val="es-ES"/>
+        </w:rPr>
+        <w:t>.</w:t>
       </w:r>
     </w:p>
     <w:p>
@@ -1829,21 +1903,25 @@
         <w:rPr>
           <w:lang w:val="es-ES"/>
         </w:rPr>
-        <w:t xml:space="preserve">1.- Añadir el atributo </w:t>
-      </w:r>
-      <w:proofErr w:type="spellStart"/>
+        <w:t xml:space="preserve">6.- Se han añadido algunas validaciones </w:t>
+      </w:r>
       <w:r>
         <w:rPr>
           <w:lang w:val="es-ES"/>
         </w:rPr>
-        <w:t>indicator</w:t>
-      </w:r>
-      <w:proofErr w:type="spellEnd"/>
+        <w:t xml:space="preserve">(se han creado etiquetas para sus respectivos mensajes de error) </w:t>
+      </w:r>
       <w:r>
         <w:rPr>
           <w:lang w:val="es-ES"/>
         </w:rPr>
-        <w:t xml:space="preserve"> en la entidad.</w:t>
+        <w:t>que utilizan este atributo debido a la lógica del requisito</w:t>
+      </w:r>
+      <w:r>
+        <w:rPr>
+          <w:lang w:val="es-ES"/>
+        </w:rPr>
+        <w:t xml:space="preserve"> 5 y 9.</w:t>
       </w:r>
     </w:p>
     <w:p>
@@ -1857,430 +1935,45 @@
         <w:rPr>
           <w:lang w:val="es-ES"/>
         </w:rPr>
-        <w:t xml:space="preserve">2.- Añadir el nuevo atributo en los métodos </w:t>
-      </w:r>
-      <w:proofErr w:type="spellStart"/>
+        <w:t>7.- Se han rehecho los tests de las features asociadas a esta entidad tratando de mantener un porcentaje similar</w:t>
+      </w:r>
       <w:r>
         <w:rPr>
           <w:lang w:val="es-ES"/>
         </w:rPr>
-        <w:t>bind</w:t>
-      </w:r>
-      <w:proofErr w:type="spellEnd"/>
+        <w:t xml:space="preserve"> al anterior</w:t>
+      </w:r>
       <w:r>
         <w:rPr>
           <w:lang w:val="es-ES"/>
         </w:rPr>
-        <w:t xml:space="preserve"> y </w:t>
-      </w:r>
-      <w:proofErr w:type="spellStart"/>
-      <w:r>
+        <w:t>.</w:t>
+      </w:r>
+    </w:p>
+    <w:p>
+      <w:pPr>
+        <w:pStyle w:val="Comment-Grader"/>
         <w:rPr>
           <w:lang w:val="es-ES"/>
         </w:rPr>
-        <w:t>unbind</w:t>
-      </w:r>
-      <w:proofErr w:type="spellEnd"/>
+      </w:pPr>
       <w:r>
         <w:rPr>
           <w:lang w:val="es-ES"/>
         </w:rPr>
-        <w:t xml:space="preserve"> donde correspondiera en las distintas </w:t>
-      </w:r>
-      <w:proofErr w:type="spellStart"/>
+        <w:t>8.-</w:t>
+      </w:r>
       <w:r>
         <w:rPr>
           <w:lang w:val="es-ES"/>
         </w:rPr>
-        <w:t>features</w:t>
-      </w:r>
-      <w:proofErr w:type="spellEnd"/>
+        <w:t xml:space="preserve"> </w:t>
+      </w:r>
       <w:r>
         <w:rPr>
           <w:lang w:val="es-ES"/>
         </w:rPr>
-        <w:t xml:space="preserve"> de los Tracking logs.</w:t>
-      </w:r>
-    </w:p>
-    <w:p>
-      <w:pPr>
-        <w:pStyle w:val="Comment-Grader"/>
-        <w:rPr>
-          <w:lang w:val="es-ES"/>
-        </w:rPr>
-      </w:pPr>
-      <w:r>
-        <w:rPr>
-          <w:lang w:val="es-ES"/>
-        </w:rPr>
-        <w:t>3.-</w:t>
-      </w:r>
-      <w:r>
-        <w:rPr>
-          <w:lang w:val="es-ES"/>
-        </w:rPr>
-        <w:t xml:space="preserve"> </w:t>
-      </w:r>
-      <w:r>
-        <w:rPr>
-          <w:lang w:val="es-ES"/>
-        </w:rPr>
-        <w:t xml:space="preserve">Al ser un atributo tipo enumerado en los métodos </w:t>
-      </w:r>
-      <w:proofErr w:type="spellStart"/>
-      <w:r>
-        <w:rPr>
-          <w:lang w:val="es-ES"/>
-        </w:rPr>
-        <w:t>unbind</w:t>
-      </w:r>
-      <w:proofErr w:type="spellEnd"/>
-      <w:r>
-        <w:rPr>
-          <w:lang w:val="es-ES"/>
-        </w:rPr>
-        <w:t xml:space="preserve"> debemos crear atributos tipo </w:t>
-      </w:r>
-      <w:proofErr w:type="spellStart"/>
-      <w:r>
-        <w:rPr>
-          <w:lang w:val="es-ES"/>
-        </w:rPr>
-        <w:t>SelectChoices</w:t>
-      </w:r>
-      <w:proofErr w:type="spellEnd"/>
-      <w:r>
-        <w:rPr>
-          <w:lang w:val="es-ES"/>
-        </w:rPr>
-        <w:t xml:space="preserve"> para este y añadirlos al </w:t>
-      </w:r>
-      <w:proofErr w:type="spellStart"/>
-      <w:r>
-        <w:rPr>
-          <w:lang w:val="es-ES"/>
-        </w:rPr>
-        <w:t>datset</w:t>
-      </w:r>
-      <w:proofErr w:type="spellEnd"/>
-      <w:r>
-        <w:rPr>
-          <w:lang w:val="es-ES"/>
-        </w:rPr>
-        <w:t>.</w:t>
-      </w:r>
-    </w:p>
-    <w:p>
-      <w:pPr>
-        <w:pStyle w:val="Comment-Grader"/>
-        <w:rPr>
-          <w:lang w:val="es-ES"/>
-        </w:rPr>
-      </w:pPr>
-      <w:r>
-        <w:rPr>
-          <w:lang w:val="es-ES"/>
-        </w:rPr>
-        <w:lastRenderedPageBreak/>
-        <w:t xml:space="preserve">4.- Añadir nuevas etiquetas para el elemento </w:t>
-      </w:r>
-      <w:proofErr w:type="spellStart"/>
-      <w:r>
-        <w:rPr>
-          <w:lang w:val="es-ES"/>
-        </w:rPr>
-        <w:t>indicator</w:t>
-      </w:r>
-      <w:proofErr w:type="spellEnd"/>
-      <w:r>
-        <w:rPr>
-          <w:lang w:val="es-ES"/>
-        </w:rPr>
-        <w:t xml:space="preserve"> en los </w:t>
-      </w:r>
-      <w:proofErr w:type="spellStart"/>
-      <w:r>
-        <w:rPr>
-          <w:lang w:val="es-ES"/>
-        </w:rPr>
-        <w:t>form.jsp</w:t>
-      </w:r>
-      <w:proofErr w:type="spellEnd"/>
-      <w:r>
-        <w:rPr>
-          <w:lang w:val="es-ES"/>
-        </w:rPr>
-        <w:t xml:space="preserve"> y </w:t>
-      </w:r>
-      <w:proofErr w:type="spellStart"/>
-      <w:r>
-        <w:rPr>
-          <w:lang w:val="es-ES"/>
-        </w:rPr>
-        <w:t>list.jsp</w:t>
-      </w:r>
-      <w:proofErr w:type="spellEnd"/>
-      <w:r>
-        <w:rPr>
-          <w:lang w:val="es-ES"/>
-        </w:rPr>
-        <w:t xml:space="preserve"> (se ha decidido que cuando se use el comando “</w:t>
-      </w:r>
-      <w:proofErr w:type="spellStart"/>
-      <w:r>
-        <w:rPr>
-          <w:lang w:val="es-ES"/>
-        </w:rPr>
-        <w:t>create</w:t>
-      </w:r>
-      <w:proofErr w:type="spellEnd"/>
-      <w:r>
-        <w:rPr>
-          <w:lang w:val="es-ES"/>
-        </w:rPr>
-        <w:t xml:space="preserve">” este elemento sea de tipo </w:t>
-      </w:r>
-      <w:proofErr w:type="spellStart"/>
-      <w:r>
-        <w:rPr>
-          <w:lang w:val="es-ES"/>
-        </w:rPr>
-        <w:t>readonly</w:t>
-      </w:r>
-      <w:proofErr w:type="spellEnd"/>
-      <w:r>
-        <w:rPr>
-          <w:lang w:val="es-ES"/>
-        </w:rPr>
-        <w:t xml:space="preserve"> con un valor por defecto)</w:t>
-      </w:r>
-      <w:r>
-        <w:rPr>
-          <w:lang w:val="es-ES"/>
-        </w:rPr>
-        <w:t xml:space="preserve"> (se ha controlado el posible </w:t>
-      </w:r>
-      <w:proofErr w:type="spellStart"/>
-      <w:r>
-        <w:rPr>
-          <w:lang w:val="es-ES"/>
-        </w:rPr>
-        <w:t>hack</w:t>
-      </w:r>
-      <w:proofErr w:type="spellEnd"/>
-      <w:r>
-        <w:rPr>
-          <w:lang w:val="es-ES"/>
-        </w:rPr>
-        <w:t xml:space="preserve"> en el método </w:t>
-      </w:r>
-      <w:proofErr w:type="spellStart"/>
-      <w:r>
-        <w:rPr>
-          <w:lang w:val="es-ES"/>
-        </w:rPr>
-        <w:t>bind</w:t>
-      </w:r>
-      <w:proofErr w:type="spellEnd"/>
-      <w:r>
-        <w:rPr>
-          <w:lang w:val="es-ES"/>
-        </w:rPr>
-        <w:t xml:space="preserve"> del </w:t>
-      </w:r>
-      <w:proofErr w:type="spellStart"/>
-      <w:r>
-        <w:rPr>
-          <w:lang w:val="es-ES"/>
-        </w:rPr>
-        <w:t>create</w:t>
-      </w:r>
-      <w:proofErr w:type="spellEnd"/>
-      <w:r>
-        <w:rPr>
-          <w:lang w:val="es-ES"/>
-        </w:rPr>
-        <w:t>)</w:t>
-      </w:r>
-      <w:r>
-        <w:rPr>
-          <w:lang w:val="es-ES"/>
-        </w:rPr>
-        <w:t>.</w:t>
-      </w:r>
-    </w:p>
-    <w:p>
-      <w:pPr>
-        <w:pStyle w:val="Comment-Grader"/>
-        <w:rPr>
-          <w:lang w:val="es-ES"/>
-        </w:rPr>
-      </w:pPr>
-      <w:r>
-        <w:rPr>
-          <w:lang w:val="es-ES"/>
-        </w:rPr>
-        <w:t xml:space="preserve">5.- Añadir el atributo en el </w:t>
-      </w:r>
-      <w:proofErr w:type="spellStart"/>
-      <w:r>
-        <w:rPr>
-          <w:lang w:val="es-ES"/>
-        </w:rPr>
-        <w:t>csv</w:t>
-      </w:r>
-      <w:proofErr w:type="spellEnd"/>
-      <w:r>
-        <w:rPr>
-          <w:lang w:val="es-ES"/>
-        </w:rPr>
-        <w:t xml:space="preserve"> correspondiente y darle </w:t>
-      </w:r>
-      <w:proofErr w:type="gramStart"/>
-      <w:r>
-        <w:rPr>
-          <w:lang w:val="es-ES"/>
-        </w:rPr>
-        <w:t>valores acorde</w:t>
-      </w:r>
-      <w:proofErr w:type="gramEnd"/>
-      <w:r>
-        <w:rPr>
-          <w:lang w:val="es-ES"/>
-        </w:rPr>
-        <w:t xml:space="preserve"> al contexto del log</w:t>
-      </w:r>
-      <w:r>
-        <w:rPr>
-          <w:lang w:val="es-ES"/>
-        </w:rPr>
-        <w:t>.</w:t>
-      </w:r>
-    </w:p>
-    <w:p>
-      <w:pPr>
-        <w:pStyle w:val="Comment-Grader"/>
-        <w:rPr>
-          <w:lang w:val="es-ES"/>
-        </w:rPr>
-      </w:pPr>
-      <w:r>
-        <w:rPr>
-          <w:lang w:val="es-ES"/>
-        </w:rPr>
-        <w:t xml:space="preserve">6.- Se han añadido algunas validaciones </w:t>
-      </w:r>
-      <w:r>
-        <w:rPr>
-          <w:lang w:val="es-ES"/>
-        </w:rPr>
-        <w:t xml:space="preserve">(se han creado etiquetas para sus respectivos mensajes de error) </w:t>
-      </w:r>
-      <w:r>
-        <w:rPr>
-          <w:lang w:val="es-ES"/>
-        </w:rPr>
-        <w:t>que utilizan este atributo debido a la lógica del requisito</w:t>
-      </w:r>
-      <w:r>
-        <w:rPr>
-          <w:lang w:val="es-ES"/>
-        </w:rPr>
-        <w:t xml:space="preserve"> 5 y 9.</w:t>
-      </w:r>
-    </w:p>
-    <w:p>
-      <w:pPr>
-        <w:pStyle w:val="Comment-Grader"/>
-        <w:rPr>
-          <w:lang w:val="es-ES"/>
-        </w:rPr>
-      </w:pPr>
-      <w:r>
-        <w:rPr>
-          <w:lang w:val="es-ES"/>
-        </w:rPr>
-        <w:t xml:space="preserve">7.- Se han rehecho los </w:t>
-      </w:r>
-      <w:proofErr w:type="spellStart"/>
-      <w:r>
-        <w:rPr>
-          <w:lang w:val="es-ES"/>
-        </w:rPr>
-        <w:t>tests</w:t>
-      </w:r>
-      <w:proofErr w:type="spellEnd"/>
-      <w:r>
-        <w:rPr>
-          <w:lang w:val="es-ES"/>
-        </w:rPr>
-        <w:t xml:space="preserve"> de las </w:t>
-      </w:r>
-      <w:proofErr w:type="spellStart"/>
-      <w:r>
-        <w:rPr>
-          <w:lang w:val="es-ES"/>
-        </w:rPr>
-        <w:t>features</w:t>
-      </w:r>
-      <w:proofErr w:type="spellEnd"/>
-      <w:r>
-        <w:rPr>
-          <w:lang w:val="es-ES"/>
-        </w:rPr>
-        <w:t xml:space="preserve"> asociadas a esta entidad tratando de mantener un porcentaje similar</w:t>
-      </w:r>
-      <w:r>
-        <w:rPr>
-          <w:lang w:val="es-ES"/>
-        </w:rPr>
-        <w:t xml:space="preserve"> al anterior</w:t>
-      </w:r>
-      <w:r>
-        <w:rPr>
-          <w:lang w:val="es-ES"/>
-        </w:rPr>
-        <w:t>.</w:t>
-      </w:r>
-    </w:p>
-    <w:p>
-      <w:pPr>
-        <w:pStyle w:val="Comment-Grader"/>
-        <w:rPr>
-          <w:lang w:val="es-ES"/>
-        </w:rPr>
-      </w:pPr>
-      <w:r>
-        <w:rPr>
-          <w:lang w:val="es-ES"/>
-        </w:rPr>
-        <w:t>8.-</w:t>
-      </w:r>
-      <w:r>
-        <w:rPr>
-          <w:lang w:val="es-ES"/>
-        </w:rPr>
-        <w:t xml:space="preserve"> </w:t>
-      </w:r>
-      <w:r>
-        <w:rPr>
-          <w:lang w:val="es-ES"/>
-        </w:rPr>
-        <w:t xml:space="preserve">Se ha modificado el reporte de </w:t>
-      </w:r>
-      <w:proofErr w:type="spellStart"/>
-      <w:r>
-        <w:rPr>
-          <w:lang w:val="es-ES"/>
-        </w:rPr>
-        <w:t>testing</w:t>
-      </w:r>
-      <w:proofErr w:type="spellEnd"/>
-      <w:r>
-        <w:rPr>
-          <w:lang w:val="es-ES"/>
-        </w:rPr>
-        <w:t xml:space="preserve"> con los cambios necesarios para que la información se encuentre actualizada.</w:t>
+        <w:t>Se ha modificado el reporte de testing con los cambios necesarios para que la información se encuentre actualizada.</w:t>
       </w:r>
     </w:p>
     <w:p>
@@ -2924,109 +2617,39 @@
           <w:lang w:val="es-ES"/>
         </w:rPr>
         <w:br/>
-        <w:t xml:space="preserve">Es posible asociar un </w:t>
-      </w:r>
-      <w:proofErr w:type="spellStart"/>
+        <w:t>Es posible asociar un c</w:t>
+      </w:r>
       <w:r>
         <w:rPr>
           <w:lang w:val="es-ES"/>
         </w:rPr>
-        <w:t>c</w:t>
+        <w:t>lain a un Leg que no aparece en el selector mediante POST hacking:</w:t>
       </w:r>
       <w:r>
         <w:rPr>
           <w:lang w:val="es-ES"/>
         </w:rPr>
-        <w:t>lain</w:t>
-      </w:r>
-      <w:proofErr w:type="spellEnd"/>
-      <w:r>
+        <w:br/>
+      </w:r>
+    </w:p>
+    <w:p>
+      <w:pPr>
+        <w:pStyle w:val="Comment-Grader"/>
         <w:rPr>
           <w:lang w:val="es-ES"/>
         </w:rPr>
-        <w:t xml:space="preserve"> a un </w:t>
-      </w:r>
-      <w:proofErr w:type="spellStart"/>
+      </w:pPr>
       <w:r>
         <w:rPr>
           <w:lang w:val="es-ES"/>
         </w:rPr>
-        <w:t>Leg</w:t>
-      </w:r>
-      <w:proofErr w:type="spellEnd"/>
+        <w:t>Manuel J. Benito Merchán</w:t>
+      </w:r>
       <w:r>
         <w:rPr>
           <w:lang w:val="es-ES"/>
         </w:rPr>
-        <w:t xml:space="preserve"> que no aparece en el selector mediante POST hacking:</w:t>
-      </w:r>
-      <w:r>
-        <w:rPr>
-          <w:lang w:val="es-ES"/>
-        </w:rPr>
-        <w:br/>
-      </w:r>
-    </w:p>
-    <w:p>
-      <w:pPr>
-        <w:pStyle w:val="Comment-Grader"/>
-        <w:rPr>
-          <w:lang w:val="es-ES"/>
-        </w:rPr>
-      </w:pPr>
-      <w:r>
-        <w:rPr>
-          <w:lang w:val="es-ES"/>
-        </w:rPr>
-        <w:t>Manuel J. Benito Merchán</w:t>
-      </w:r>
-      <w:r>
-        <w:rPr>
-          <w:lang w:val="es-ES"/>
-        </w:rPr>
-        <w:t xml:space="preserve"> - Esta corrección es incorrecta ya que el </w:t>
-      </w:r>
-      <w:proofErr w:type="spellStart"/>
-      <w:r>
-        <w:rPr>
-          <w:lang w:val="es-ES"/>
-        </w:rPr>
-        <w:t>authorise</w:t>
-      </w:r>
-      <w:proofErr w:type="spellEnd"/>
-      <w:r>
-        <w:rPr>
-          <w:lang w:val="es-ES"/>
-        </w:rPr>
-        <w:t xml:space="preserve"> no permite este tipo de hacking, debido a que solo se aceptan los </w:t>
-      </w:r>
-      <w:proofErr w:type="spellStart"/>
-      <w:r>
-        <w:rPr>
-          <w:lang w:val="es-ES"/>
-        </w:rPr>
-        <w:t>legs</w:t>
-      </w:r>
-      <w:proofErr w:type="spellEnd"/>
-      <w:r>
-        <w:rPr>
-          <w:lang w:val="es-ES"/>
-        </w:rPr>
-        <w:t xml:space="preserve"> que existen actualmente en el sistema y previamente el requisito ya había sido aceptado y por lo tanto la </w:t>
-      </w:r>
-      <w:proofErr w:type="spellStart"/>
-      <w:r>
-        <w:rPr>
-          <w:lang w:val="es-ES"/>
-        </w:rPr>
-        <w:t>feature</w:t>
-      </w:r>
-      <w:proofErr w:type="spellEnd"/>
-      <w:r>
-        <w:rPr>
-          <w:lang w:val="es-ES"/>
-        </w:rPr>
-        <w:t xml:space="preserve"> no se modificó. El profesor Manuel J. Jiménez ya se encargó de revisarlo y marcarlo como requisito cumplido. </w:t>
+        <w:t xml:space="preserve"> - Esta corrección es incorrecta ya que el authorise no permite este tipo de hacking, debido a que solo se aceptan los legs que existen actualmente en el sistema y previamente el requisito ya había sido aceptado y por lo tanto la feature no se modificó. El profesor Manuel J. Jiménez ya se encargó de revisarlo y marcarlo como requisito cumplido. </w:t>
       </w:r>
     </w:p>
     <w:p>
@@ -3249,83 +2872,13 @@
         <w:rPr>
           <w:lang w:val="es-ES"/>
         </w:rPr>
-        <w:t xml:space="preserve">Manuel J. Benito Merchán - Para solucionar el primer problema se ha añadido una validación con su respectiva etiqueta de mensaje de error en la </w:t>
-      </w:r>
-      <w:proofErr w:type="spellStart"/>
+        <w:t>Manuel J. Benito Merchán - Para solucionar el primer problema se ha añadido una validación con su respectiva etiqueta de mensaje de error en la feature de create y update que no permite esto y se ha modificado la relación con claim en el UML</w:t>
+      </w:r>
       <w:r>
         <w:rPr>
           <w:lang w:val="es-ES"/>
         </w:rPr>
-        <w:t>feature</w:t>
-      </w:r>
-      <w:proofErr w:type="spellEnd"/>
-      <w:r>
-        <w:rPr>
-          <w:lang w:val="es-ES"/>
-        </w:rPr>
-        <w:t xml:space="preserve"> de </w:t>
-      </w:r>
-      <w:proofErr w:type="spellStart"/>
-      <w:r>
-        <w:rPr>
-          <w:lang w:val="es-ES"/>
-        </w:rPr>
-        <w:t>create</w:t>
-      </w:r>
-      <w:proofErr w:type="spellEnd"/>
-      <w:r>
-        <w:rPr>
-          <w:lang w:val="es-ES"/>
-        </w:rPr>
-        <w:t xml:space="preserve"> y </w:t>
-      </w:r>
-      <w:proofErr w:type="spellStart"/>
-      <w:r>
-        <w:rPr>
-          <w:lang w:val="es-ES"/>
-        </w:rPr>
-        <w:t>update</w:t>
-      </w:r>
-      <w:proofErr w:type="spellEnd"/>
-      <w:r>
-        <w:rPr>
-          <w:lang w:val="es-ES"/>
-        </w:rPr>
-        <w:t xml:space="preserve"> que no permite esto y se ha modificado la relación con </w:t>
-      </w:r>
-      <w:proofErr w:type="spellStart"/>
-      <w:r>
-        <w:rPr>
-          <w:lang w:val="es-ES"/>
-        </w:rPr>
-        <w:t>claim</w:t>
-      </w:r>
-      <w:proofErr w:type="spellEnd"/>
-      <w:r>
-        <w:rPr>
-          <w:lang w:val="es-ES"/>
-        </w:rPr>
-        <w:t xml:space="preserve"> en el UML</w:t>
-      </w:r>
-      <w:r>
-        <w:rPr>
-          <w:lang w:val="es-ES"/>
-        </w:rPr>
-        <w:t xml:space="preserve"> (La relación sigue siendo </w:t>
-      </w:r>
-      <w:proofErr w:type="spellStart"/>
-      <w:r>
-        <w:rPr>
-          <w:lang w:val="es-ES"/>
-        </w:rPr>
-        <w:t>ManyToOne</w:t>
-      </w:r>
-      <w:proofErr w:type="spellEnd"/>
-      <w:r>
-        <w:rPr>
-          <w:lang w:val="es-ES"/>
-        </w:rPr>
-        <w:t xml:space="preserve">, pero la multiplicidad </w:t>
+        <w:t xml:space="preserve"> (La relación sigue siendo ManyToOne, pero la multiplicidad </w:t>
       </w:r>
       <w:r>
         <w:rPr>
@@ -3346,21 +2899,7 @@
         <w:rPr>
           <w:lang w:val="es-ES"/>
         </w:rPr>
-        <w:t xml:space="preserve">2 -&gt; 1 ya que solo se permiten 2 logs como máximo por </w:t>
-      </w:r>
-      <w:proofErr w:type="spellStart"/>
-      <w:r>
-        <w:rPr>
-          <w:lang w:val="es-ES"/>
-        </w:rPr>
-        <w:t>claim</w:t>
-      </w:r>
-      <w:proofErr w:type="spellEnd"/>
-      <w:r>
-        <w:rPr>
-          <w:lang w:val="es-ES"/>
-        </w:rPr>
-        <w:t>, para que así haya una mayor claridad y transparencia)</w:t>
+        <w:t>2 -&gt; 1 ya que solo se permiten 2 logs como máximo por claim, para que así haya una mayor claridad y transparencia)</w:t>
       </w:r>
       <w:r>
         <w:rPr>
@@ -3381,35 +2920,7 @@
         <w:rPr>
           <w:lang w:val="es-ES"/>
         </w:rPr>
-        <w:t xml:space="preserve">Manuel J. Benito Merchán - Para solucionar el segundo problema se ha añadido una validación con su respectiva etiqueta de mensaje de error en la </w:t>
-      </w:r>
-      <w:proofErr w:type="spellStart"/>
-      <w:r>
-        <w:rPr>
-          <w:lang w:val="es-ES"/>
-        </w:rPr>
-        <w:t>feature</w:t>
-      </w:r>
-      <w:proofErr w:type="spellEnd"/>
-      <w:r>
-        <w:rPr>
-          <w:lang w:val="es-ES"/>
-        </w:rPr>
-        <w:t xml:space="preserve"> de </w:t>
-      </w:r>
-      <w:proofErr w:type="spellStart"/>
-      <w:r>
-        <w:rPr>
-          <w:lang w:val="es-ES"/>
-        </w:rPr>
-        <w:t>update</w:t>
-      </w:r>
-      <w:proofErr w:type="spellEnd"/>
-      <w:r>
-        <w:rPr>
-          <w:lang w:val="es-ES"/>
-        </w:rPr>
-        <w:t xml:space="preserve"> que no permite esto.</w:t>
+        <w:t>Manuel J. Benito Merchán - Para solucionar el segundo problema se ha añadido una validación con su respectiva etiqueta de mensaje de error en la feature de update que no permite esto.</w:t>
       </w:r>
       <w:r>
         <w:rPr>
@@ -3432,75 +2943,30 @@
           <w:highlight w:val="yellow"/>
           <w:lang w:val="es-ES"/>
         </w:rPr>
-        <w:t xml:space="preserve">2nd </w:t>
-      </w:r>
-      <w:proofErr w:type="spellStart"/>
-      <w:r>
-        <w:rPr>
-          <w:b/>
-          <w:bCs/>
-          <w:sz w:val="32"/>
-          <w:szCs w:val="32"/>
+        <w:t>2nd Call</w:t>
+      </w:r>
+      <w:r>
+        <w:rPr>
           <w:highlight w:val="yellow"/>
           <w:lang w:val="es-ES"/>
         </w:rPr>
-        <w:t>Call</w:t>
-      </w:r>
-      <w:proofErr w:type="spellEnd"/>
+        <w:br/>
+        <w:t>La solución proporcionada no es adecuada. El sistema no puede limitar una claim a solo 2 tracking logs dado que los requisitos dan a entender que puede haber varios. Lo establecido en clase y lo discutido en los foros es que es posible tener como máximo 2 tracking logs con un porcentaje del 100%.</w:t>
+      </w:r>
       <w:r>
         <w:rPr>
           <w:highlight w:val="yellow"/>
           <w:lang w:val="es-ES"/>
         </w:rPr>
         <w:br/>
-        <w:t xml:space="preserve">La solución proporcionada no es adecuada. El sistema no puede limitar una </w:t>
-      </w:r>
-      <w:proofErr w:type="spellStart"/>
+      </w:r>
       <w:r>
         <w:rPr>
           <w:highlight w:val="yellow"/>
           <w:lang w:val="es-ES"/>
         </w:rPr>
-        <w:t>claim</w:t>
-      </w:r>
-      <w:proofErr w:type="spellEnd"/>
-      <w:r>
-        <w:rPr>
-          <w:highlight w:val="yellow"/>
-          <w:lang w:val="es-ES"/>
-        </w:rPr>
-        <w:t xml:space="preserve"> a solo 2 tracking logs dado que los requisitos dan a entender que puede haber varios. Lo establecido en clase y lo discutido en los foros es que es posible tener como máximo 2 tracking logs con un porcentaje del 100%.</w:t>
-      </w:r>
-      <w:r>
-        <w:rPr>
-          <w:highlight w:val="yellow"/>
-          <w:lang w:val="es-ES"/>
-        </w:rPr>
         <w:br/>
-      </w:r>
-      <w:r>
-        <w:rPr>
-          <w:highlight w:val="yellow"/>
-          <w:lang w:val="es-ES"/>
-        </w:rPr>
-        <w:br/>
-        <w:t xml:space="preserve">Aparte, es posible publicar un tracking log durante la creación directamente mediante post hacking. En mi caso, he habilitado el </w:t>
-      </w:r>
-      <w:proofErr w:type="spellStart"/>
-      <w:r>
-        <w:rPr>
-          <w:highlight w:val="yellow"/>
-          <w:lang w:val="es-ES"/>
-        </w:rPr>
-        <w:t>ckeckbox</w:t>
-      </w:r>
-      <w:proofErr w:type="spellEnd"/>
-      <w:r>
-        <w:rPr>
-          <w:highlight w:val="yellow"/>
-          <w:lang w:val="es-ES"/>
-        </w:rPr>
-        <w:t xml:space="preserve"> de publicación.</w:t>
+        <w:t>Aparte, es posible publicar un tracking log durante la creación directamente mediante post hacking. En mi caso, he habilitado el ckeckbox de publicación.</w:t>
       </w:r>
     </w:p>
     <w:p>
@@ -3568,109 +3034,25 @@
         <w:rPr>
           <w:lang w:val="es-ES"/>
         </w:rPr>
-        <w:t xml:space="preserve"> logs para una sola </w:t>
-      </w:r>
-      <w:proofErr w:type="spellStart"/>
+        <w:t xml:space="preserve"> logs para una sola claim y con esto me refiero a que solo se entiende que una claim tiene un tracking log que se va actualizando cada vez que el procedimiento de la propia claim va avanzando</w:t>
+      </w:r>
       <w:r>
         <w:rPr>
           <w:lang w:val="es-ES"/>
         </w:rPr>
-        <w:t>claim</w:t>
-      </w:r>
-      <w:proofErr w:type="spellEnd"/>
+        <w:t xml:space="preserve"> y que en casos excepcionales en que el cliente “exprese desacuerdo” se creará uno adicional, por lo que entiendo que solo existen 2 tracking logs como máximo por claim. Segundo, tras comentar mi desacuerdo con el profesor Manuel J. Jiménez, este me dijo: “</w:t>
+      </w:r>
       <w:r>
         <w:rPr>
           <w:lang w:val="es-ES"/>
         </w:rPr>
-        <w:t xml:space="preserve"> y con esto me refiero a que solo se entiende que una </w:t>
-      </w:r>
-      <w:proofErr w:type="spellStart"/>
+        <w:t>Considera el escenario donde un usuario debe crear 5 Tracking Logs con porcentaje 10, 40, 60, 100 y 100 (excepcional)</w:t>
+      </w:r>
       <w:r>
         <w:rPr>
           <w:lang w:val="es-ES"/>
         </w:rPr>
-        <w:t>claim</w:t>
-      </w:r>
-      <w:proofErr w:type="spellEnd"/>
-      <w:r>
-        <w:rPr>
-          <w:lang w:val="es-ES"/>
-        </w:rPr>
-        <w:t xml:space="preserve"> tiene un tracking log que se va actualizando cada vez que el procedimiento de la propia </w:t>
-      </w:r>
-      <w:proofErr w:type="spellStart"/>
-      <w:r>
-        <w:rPr>
-          <w:lang w:val="es-ES"/>
-        </w:rPr>
-        <w:t>claim</w:t>
-      </w:r>
-      <w:proofErr w:type="spellEnd"/>
-      <w:r>
-        <w:rPr>
-          <w:lang w:val="es-ES"/>
-        </w:rPr>
-        <w:t xml:space="preserve"> va avanzando</w:t>
-      </w:r>
-      <w:r>
-        <w:rPr>
-          <w:lang w:val="es-ES"/>
-        </w:rPr>
-        <w:t xml:space="preserve"> y que en casos excepcionales en que el cliente “exprese desacuerdo” se creará uno adicional, por lo que entiendo que solo existen 2 tracking logs como máximo por </w:t>
-      </w:r>
-      <w:proofErr w:type="spellStart"/>
-      <w:r>
-        <w:rPr>
-          <w:lang w:val="es-ES"/>
-        </w:rPr>
-        <w:t>claim</w:t>
-      </w:r>
-      <w:proofErr w:type="spellEnd"/>
-      <w:r>
-        <w:rPr>
-          <w:lang w:val="es-ES"/>
-        </w:rPr>
-        <w:t>. Segundo, tras comentar mi desacuerdo con el profesor Manuel J. Jiménez, este me dijo: “</w:t>
-      </w:r>
-      <w:r>
-        <w:rPr>
-          <w:lang w:val="es-ES"/>
-        </w:rPr>
-        <w:t>Considera el escenario donde un usuario debe crear 5 Tracking Logs con porcentaje 10, 40, 60, 100 y 100 (excepcional)</w:t>
-      </w:r>
-      <w:r>
-        <w:rPr>
-          <w:lang w:val="es-ES"/>
-        </w:rPr>
-        <w:t xml:space="preserve">” y entiendo el punto al que quiere llegar, pero si esto fuera así, me da a entender que la </w:t>
-      </w:r>
-      <w:proofErr w:type="spellStart"/>
-      <w:r>
-        <w:rPr>
-          <w:lang w:val="es-ES"/>
-        </w:rPr>
-        <w:t>feature</w:t>
-      </w:r>
-      <w:proofErr w:type="spellEnd"/>
-      <w:r>
-        <w:rPr>
-          <w:lang w:val="es-ES"/>
-        </w:rPr>
-        <w:t xml:space="preserve"> de </w:t>
-      </w:r>
-      <w:proofErr w:type="spellStart"/>
-      <w:r>
-        <w:rPr>
-          <w:lang w:val="es-ES"/>
-        </w:rPr>
-        <w:t>update</w:t>
-      </w:r>
-      <w:proofErr w:type="spellEnd"/>
-      <w:r>
-        <w:rPr>
-          <w:lang w:val="es-ES"/>
-        </w:rPr>
-        <w:t xml:space="preserve"> sería inservible, ya que se está creando un tracking log cada vez que avanza el proceso de reclamación y por tanto no haría falta modificar los propios logs para nada. Tercero y último, según recuerdo yo, en clase de prácticas el profesor Manuel J. Jiménez me dio el visto bueno a mi </w:t>
+        <w:t xml:space="preserve">” y entiendo el punto al que quiere llegar, pero si esto fuera así, me da a entender que la feature de update sería inservible, ya que se está creando un tracking log cada vez que avanza el proceso de reclamación y por tanto no haría falta modificar los propios logs para nada. Tercero y último, según recuerdo yo, en clase de prácticas el profesor Manuel J. Jiménez me dio el visto bueno a mi </w:t>
       </w:r>
       <w:r>
         <w:rPr>
@@ -3707,20 +3089,8 @@
           <w:szCs w:val="32"/>
           <w:lang w:val="es-ES"/>
         </w:rPr>
-        <w:t xml:space="preserve"> </w:t>
-      </w:r>
-      <w:proofErr w:type="spellStart"/>
-      <w:r>
-        <w:rPr>
-          <w:b/>
-          <w:bCs/>
-          <w:sz w:val="32"/>
-          <w:szCs w:val="32"/>
-          <w:lang w:val="es-ES"/>
-        </w:rPr>
-        <w:t>Call</w:t>
-      </w:r>
-      <w:proofErr w:type="spellEnd"/>
+        <w:t xml:space="preserve"> Call</w:t>
+      </w:r>
     </w:p>
     <w:p>
       <w:pPr>
@@ -3734,63 +3104,39 @@
         <w:rPr>
           <w:lang w:val="es-ES"/>
         </w:rPr>
-        <w:t>Manuel J. Benito Merchán</w:t>
+        <w:t>Manuel J. Benito Merchán - Se ha añadido una restricción en el TrackingLogUpdateService que limita a 2 tracking logs con un porcentaje de 100%, pero permite la creación de otros logs con el objetivo de seguir la funcionalidad esperada como bien me comentó el profesor Manuel J. Jiménez: “</w:t>
       </w:r>
       <w:r>
         <w:rPr>
           <w:lang w:val="es-ES"/>
         </w:rPr>
-        <w:t xml:space="preserve"> - Se ha añadido una restricción en el </w:t>
-      </w:r>
-      <w:proofErr w:type="spellStart"/>
+        <w:t>Considera el escenario donde un usuario debe crear 5 Tracking Logs con porcentaje 10, 40, 60, 100 y 100 (excepcional)</w:t>
+      </w:r>
       <w:r>
         <w:rPr>
           <w:lang w:val="es-ES"/>
         </w:rPr>
-        <w:t>TrackingLogUpdateService</w:t>
-      </w:r>
-      <w:proofErr w:type="spellEnd"/>
+        <w:t>”.</w:t>
+      </w:r>
       <w:r>
         <w:rPr>
           <w:lang w:val="es-ES"/>
         </w:rPr>
-        <w:t xml:space="preserve"> que limita a 2 tracking logs con un porcentaje de 100%, pero permite la creación de otros logs con el objetivo de seguir la funcionalidad esperada como bien me comentó el profesor </w:t>
-      </w:r>
+        <w:t xml:space="preserve"> Por esto se ha modificado la relación de esta entidad con las claims a una </w:t>
+      </w:r>
+      <w:proofErr w:type="gramStart"/>
       <w:r>
         <w:rPr>
           <w:lang w:val="es-ES"/>
         </w:rPr>
-        <w:t>Manuel J. Jiménez</w:t>
-      </w:r>
+        <w:t>1..</w:t>
+      </w:r>
+      <w:proofErr w:type="gramEnd"/>
       <w:r>
         <w:rPr>
           <w:lang w:val="es-ES"/>
         </w:rPr>
-        <w:t xml:space="preserve">: </w:t>
-      </w:r>
-      <w:r>
-        <w:rPr>
-          <w:lang w:val="es-ES"/>
-        </w:rPr>
-        <w:t>“</w:t>
-      </w:r>
-      <w:r>
-        <w:rPr>
-          <w:lang w:val="es-ES"/>
-        </w:rPr>
-        <w:t>Considera el escenario donde un usuario debe crear 5 Tracking Logs con porcentaje 10, 40, 60, 100 y 100 (excepcional)</w:t>
-      </w:r>
-      <w:r>
-        <w:rPr>
-          <w:lang w:val="es-ES"/>
-        </w:rPr>
-        <w:t>”</w:t>
-      </w:r>
-      <w:r>
-        <w:rPr>
-          <w:lang w:val="es-ES"/>
-        </w:rPr>
-        <w:t>.</w:t>
+        <w:t>* -&gt; 1.</w:t>
       </w:r>
     </w:p>
     <w:p>
@@ -3823,77 +3169,24 @@
         <w:rPr>
           <w:lang w:val="es-ES"/>
         </w:rPr>
-        <w:t xml:space="preserve">Por otra parte, el error de Post hacking fue solucionado eliminando del método </w:t>
-      </w:r>
-      <w:proofErr w:type="spellStart"/>
-      <w:r>
-        <w:rPr>
+        <w:t>Por otra parte, el error de Post hacking fue solucionado eliminando del método bind el atributo “isPublished” que era el que permitía este fallo.</w:t>
+      </w:r>
+    </w:p>
+    <w:p>
+      <w:pPr>
+        <w:pStyle w:val="Ttulo2"/>
+        <w:rPr>
+          <w:rFonts w:cstheme="majorHAnsi"/>
           <w:lang w:val="es-ES"/>
         </w:rPr>
-        <w:t>bind</w:t>
-      </w:r>
-      <w:proofErr w:type="spellEnd"/>
-      <w:r>
-        <w:rPr>
+      </w:pPr>
+      <w:r>
+        <w:rPr>
+          <w:rFonts w:cstheme="majorHAnsi"/>
           <w:lang w:val="es-ES"/>
         </w:rPr>
-        <w:t xml:space="preserve"> el atributo “</w:t>
-      </w:r>
-      <w:proofErr w:type="spellStart"/>
-      <w:r>
-        <w:rPr>
-          <w:lang w:val="es-ES"/>
-        </w:rPr>
-        <w:t>isPublished</w:t>
-      </w:r>
-      <w:proofErr w:type="spellEnd"/>
-      <w:r>
-        <w:rPr>
-          <w:lang w:val="es-ES"/>
-        </w:rPr>
-        <w:t>” que era el que permitía este fallo.</w:t>
-      </w:r>
-    </w:p>
-    <w:p>
-      <w:pPr>
-        <w:pStyle w:val="Ttulo2"/>
-        <w:rPr>
-          <w:rFonts w:cstheme="majorHAnsi"/>
-          <w:lang w:val="es-ES"/>
-        </w:rPr>
-      </w:pPr>
-      <w:r>
-        <w:rPr>
-          <w:rFonts w:cstheme="majorHAnsi"/>
-          <w:lang w:val="es-ES"/>
-        </w:rPr>
-        <w:t>Non-</w:t>
-      </w:r>
-      <w:proofErr w:type="spellStart"/>
-      <w:r>
-        <w:rPr>
-          <w:rFonts w:cstheme="majorHAnsi"/>
-          <w:lang w:val="es-ES"/>
-        </w:rPr>
-        <w:t>functional</w:t>
-      </w:r>
-      <w:proofErr w:type="spellEnd"/>
-      <w:r>
-        <w:rPr>
-          <w:rFonts w:cstheme="majorHAnsi"/>
-          <w:lang w:val="es-ES"/>
-        </w:rPr>
-        <w:t xml:space="preserve"> </w:t>
-      </w:r>
-      <w:proofErr w:type="spellStart"/>
-      <w:r>
-        <w:rPr>
-          <w:rFonts w:cstheme="majorHAnsi"/>
-          <w:lang w:val="es-ES"/>
-        </w:rPr>
-        <w:t>requirements</w:t>
-      </w:r>
-      <w:proofErr w:type="spellEnd"/>
+        <w:t>Non-functional requirements</w:t>
+      </w:r>
     </w:p>
     <w:p>
       <w:pPr>
@@ -4077,21 +3370,7 @@
         <w:rPr>
           <w:lang w:val="es-ES"/>
         </w:rPr>
-        <w:t xml:space="preserve">Manuel J. Benito Merchán - El enlace no es visible al público ya que según le pregunté a mis compañeros sobre esto y al creador del repositorio, hubo ciertas personas que trataron de acceder a dicho repositorio para copiar código y el creador se vio obligado a ponerlo en privado durante el periodo de la convocatoria de julio, pero ya pasado esto se olvidó de volver a ponerlo en público. El </w:t>
-      </w:r>
-      <w:proofErr w:type="spellStart"/>
-      <w:r>
-        <w:rPr>
-          <w:lang w:val="es-ES"/>
-        </w:rPr>
-        <w:t>dashboard</w:t>
-      </w:r>
-      <w:proofErr w:type="spellEnd"/>
-      <w:r>
-        <w:rPr>
-          <w:lang w:val="es-ES"/>
-        </w:rPr>
-        <w:t xml:space="preserve"> sigue en el mismo estado que al terminar el periodo de clases. Por esto y por lo anterior comentado pienso que este error ya no corre a cargo mía ya que no tengo permisos suficientes en el repositorio para controlar la privacidad y el creador ya no está pendiente a estas alturas debido a sus motivos personales.</w:t>
+        <w:t>Manuel J. Benito Merchán - El enlace no es visible al público ya que según le pregunté a mis compañeros sobre esto y al creador del repositorio, hubo ciertas personas que trataron de acceder a dicho repositorio para copiar código y el creador se vio obligado a ponerlo en privado durante el periodo de la convocatoria de julio, pero ya pasado esto se olvidó de volver a ponerlo en público. El dashboard sigue en el mismo estado que al terminar el periodo de clases. Por esto y por lo anterior comentado pienso que este error ya no corre a cargo mía ya que no tengo permisos suficientes en el repositorio para controlar la privacidad y el creador ya no está pendiente a estas alturas debido a sus motivos personales.</w:t>
       </w:r>
     </w:p>
     <w:p>
@@ -4122,39 +3401,21 @@
           <w:szCs w:val="32"/>
           <w:lang w:val="es-ES"/>
         </w:rPr>
-        <w:t xml:space="preserve"> </w:t>
-      </w:r>
-      <w:proofErr w:type="spellStart"/>
-      <w:r>
-        <w:rPr>
-          <w:b/>
-          <w:bCs/>
-          <w:sz w:val="32"/>
-          <w:szCs w:val="32"/>
+        <w:t xml:space="preserve"> Call</w:t>
+      </w:r>
+    </w:p>
+    <w:p>
+      <w:pPr>
+        <w:pStyle w:val="Comment-Grader"/>
+        <w:rPr>
           <w:lang w:val="es-ES"/>
         </w:rPr>
-        <w:t>Call</w:t>
-      </w:r>
-      <w:proofErr w:type="spellEnd"/>
-    </w:p>
-    <w:p>
-      <w:pPr>
-        <w:pStyle w:val="Comment-Grader"/>
+      </w:pPr>
+      <w:r>
         <w:rPr>
           <w:lang w:val="es-ES"/>
         </w:rPr>
-      </w:pPr>
-      <w:r>
-        <w:rPr>
-          <w:lang w:val="es-ES"/>
-        </w:rPr>
-        <w:t xml:space="preserve">Manuel J. Benito Merchán </w:t>
-      </w:r>
-      <w:r>
-        <w:rPr>
-          <w:lang w:val="es-ES"/>
-        </w:rPr>
-        <w:t>- El enlace será visible durante toda la corrección de la tercera convocatoria.</w:t>
+        <w:t>Manuel J. Benito Merchán - El enlace será visible durante toda la corrección de la tercera convocatoria.</w:t>
       </w:r>
     </w:p>
     <w:p>
@@ -12591,6 +11852,7 @@
     <w:rsid w:val="00B65BA5"/>
     <w:rsid w:val="00B85114"/>
     <w:rsid w:val="00B9388C"/>
+    <w:rsid w:val="00BB61D6"/>
     <w:rsid w:val="00C42E76"/>
     <w:rsid w:val="00C63AB0"/>
     <w:rsid w:val="00C85C89"/>
@@ -12603,6 +11865,7 @@
     <w:rsid w:val="00E718B5"/>
     <w:rsid w:val="00E92EF0"/>
     <w:rsid w:val="00E955A7"/>
+    <w:rsid w:val="00EB16B0"/>
     <w:rsid w:val="00EB3154"/>
     <w:rsid w:val="00EC1B20"/>
     <w:rsid w:val="00ED34A4"/>

</xml_diff>